<commit_message>
dokumentation & energy bild angepasst
</commit_message>
<xml_diff>
--- a/docu/documentation_mma25b_bachmann_ottiger.docx
+++ b/docu/documentation_mma25b_bachmann_ottiger.docx
@@ -82,7 +82,13 @@
     <w:sdt>
       <w:sdtPr>
         <w:rPr>
-          <w:lang w:val="de-DE"/>
+          <w:rFonts w:asciiTheme="minorHAnsi" w:eastAsiaTheme="minorHAnsi" w:hAnsiTheme="minorHAnsi" w:cstheme="minorBidi"/>
+          <w:color w:val="auto"/>
+          <w:kern w:val="2"/>
+          <w:sz w:val="24"/>
+          <w:szCs w:val="24"/>
+          <w:lang w:val="de-DE" w:eastAsia="en-US"/>
+          <w14:ligatures w14:val="standardContextual"/>
         </w:rPr>
         <w:id w:val="536552584"/>
         <w:docPartObj>
@@ -92,15 +98,8 @@
       </w:sdtPr>
       <w:sdtEndPr>
         <w:rPr>
-          <w:rFonts w:asciiTheme="minorHAnsi" w:eastAsiaTheme="minorHAnsi" w:hAnsiTheme="minorHAnsi" w:cstheme="minorBidi"/>
           <w:b/>
           <w:bCs/>
-          <w:color w:val="auto"/>
-          <w:kern w:val="2"/>
-          <w:sz w:val="24"/>
-          <w:szCs w:val="24"/>
-          <w:lang w:eastAsia="en-US"/>
-          <w14:ligatures w14:val="standardContextual"/>
         </w:rPr>
       </w:sdtEndPr>
       <w:sdtContent>
@@ -900,7 +899,35 @@
         <w:rPr>
           <w:lang w:val="de-DE" w:eastAsia="de-DE"/>
         </w:rPr>
-        <w:t>Wir erstellten eine Home seite, zusätzlich eine Flavor seite und unsere Kontaktdaten.</w:t>
+        <w:t xml:space="preserve">Wir erstellten eine Home </w:t>
+      </w:r>
+      <w:proofErr w:type="spellStart"/>
+      <w:r>
+        <w:rPr>
+          <w:lang w:val="de-DE" w:eastAsia="de-DE"/>
+        </w:rPr>
+        <w:t>seite</w:t>
+      </w:r>
+      <w:proofErr w:type="spellEnd"/>
+      <w:r>
+        <w:rPr>
+          <w:lang w:val="de-DE" w:eastAsia="de-DE"/>
+        </w:rPr>
+        <w:t xml:space="preserve">, zusätzlich eine Flavor </w:t>
+      </w:r>
+      <w:proofErr w:type="spellStart"/>
+      <w:r>
+        <w:rPr>
+          <w:lang w:val="de-DE" w:eastAsia="de-DE"/>
+        </w:rPr>
+        <w:t>seite</w:t>
+      </w:r>
+      <w:proofErr w:type="spellEnd"/>
+      <w:r>
+        <w:rPr>
+          <w:lang w:val="de-DE" w:eastAsia="de-DE"/>
+        </w:rPr>
+        <w:t xml:space="preserve"> und unsere Kontaktdaten.</w:t>
       </w:r>
     </w:p>
     <w:p>
@@ -930,7 +957,20 @@
         <w:rPr>
           <w:lang w:val="de-DE" w:eastAsia="de-DE"/>
         </w:rPr>
-        <w:t xml:space="preserve">Unser eigenes CSS banden wir in Zeile 10 ein. </w:t>
+        <w:t xml:space="preserve">Unser eigenes CSS banden wir in </w:t>
+      </w:r>
+      <w:r>
+        <w:rPr>
+          <w:highlight w:val="yellow"/>
+          <w:lang w:val="de-DE" w:eastAsia="de-DE"/>
+        </w:rPr>
+        <w:t>Zeile</w:t>
+      </w:r>
+      <w:r>
+        <w:rPr>
+          <w:lang w:val="de-DE" w:eastAsia="de-DE"/>
+        </w:rPr>
+        <w:t xml:space="preserve"> 10 ein. </w:t>
       </w:r>
     </w:p>
     <w:p>
@@ -969,7 +1009,16 @@
         </w:r>
       </w:hyperlink>
       <w:r>
-        <w:t xml:space="preserve"> verknüpften wir auf Zeile 8.</w:t>
+        <w:t xml:space="preserve"> verknüpften wir auf </w:t>
+      </w:r>
+      <w:r>
+        <w:rPr>
+          <w:highlight w:val="yellow"/>
+        </w:rPr>
+        <w:t>Zeile</w:t>
+      </w:r>
+      <w:r>
+        <w:t xml:space="preserve"> 8.</w:t>
       </w:r>
     </w:p>
     <w:p/>
@@ -1023,6 +1072,7 @@
       </w:r>
       <w:r>
         <w:rPr>
+          <w:highlight w:val="yellow"/>
           <w:lang w:val="de-DE" w:eastAsia="de-DE"/>
         </w:rPr>
         <w:t xml:space="preserve">Zeile </w:t>
@@ -1047,25 +1097,48 @@
         <w:rPr>
           <w:lang w:val="de-DE" w:eastAsia="de-DE"/>
         </w:rPr>
-        <w:t>Desktop mit drei Spalten (zwei unterschiedliche Spaltenbreiten</w:t>
-      </w:r>
-      <w:r>
-        <w:rPr>
-          <w:lang w:val="de-DE" w:eastAsia="de-DE"/>
-        </w:rPr>
-        <w:t>):</w:t>
+        <w:t xml:space="preserve">Desktop mit drei Spalten </w:t>
+      </w:r>
+      <w:r>
+        <w:rPr>
+          <w:sz w:val="20"/>
+          <w:szCs w:val="20"/>
+          <w:lang w:val="de-DE" w:eastAsia="de-DE"/>
+        </w:rPr>
+        <w:t>(zwei unterschiedliche Spaltenbreiten</w:t>
+      </w:r>
+      <w:r>
+        <w:rPr>
+          <w:sz w:val="20"/>
+          <w:szCs w:val="20"/>
+          <w:lang w:val="de-DE" w:eastAsia="de-DE"/>
+        </w:rPr>
+        <w:t>)</w:t>
+      </w:r>
+      <w:r>
+        <w:rPr>
+          <w:lang w:val="de-DE" w:eastAsia="de-DE"/>
+        </w:rPr>
+        <w:t>:</w:t>
       </w:r>
       <w:r>
         <w:rPr>
           <w:lang w:val="de-DE" w:eastAsia="de-DE"/>
         </w:rPr>
         <w:tab/>
-      </w:r>
-      <w:r>
-        <w:rPr>
-          <w:lang w:val="de-DE" w:eastAsia="de-DE"/>
-        </w:rPr>
-        <w:t>Sheet _ Zeile _</w:t>
+        <w:t>Sheet</w:t>
+      </w:r>
+      <w:r>
+        <w:rPr>
+          <w:lang w:val="de-DE" w:eastAsia="de-DE"/>
+        </w:rPr>
+        <w:t xml:space="preserve"> contact.html</w:t>
+      </w:r>
+      <w:r>
+        <w:rPr>
+          <w:lang w:val="de-DE" w:eastAsia="de-DE"/>
+        </w:rPr>
+        <w:t xml:space="preserve"> </w:t>
       </w:r>
     </w:p>
     <w:p>
@@ -1081,19 +1154,71 @@
         <w:rPr>
           <w:lang w:val="de-DE" w:eastAsia="de-DE"/>
         </w:rPr>
-        <w:t>Desktiop mit vier Spalten, Tablet mit zwei Spalten:</w:t>
-      </w:r>
-      <w:r>
-        <w:rPr>
-          <w:lang w:val="de-DE" w:eastAsia="de-DE"/>
-        </w:rPr>
         <w:tab/>
       </w:r>
       <w:r>
         <w:rPr>
-          <w:lang w:val="de-DE" w:eastAsia="de-DE"/>
-        </w:rPr>
-        <w:t>Sheet _ Zeile _</w:t>
+          <w:highlight w:val="yellow"/>
+          <w:lang w:val="de-DE" w:eastAsia="de-DE"/>
+        </w:rPr>
+        <w:t>Zeile</w:t>
+      </w:r>
+      <w:r>
+        <w:rPr>
+          <w:highlight w:val="yellow"/>
+          <w:lang w:val="de-DE" w:eastAsia="de-DE"/>
+        </w:rPr>
+        <w:t>n</w:t>
+      </w:r>
+      <w:r>
+        <w:rPr>
+          <w:lang w:val="de-DE" w:eastAsia="de-DE"/>
+        </w:rPr>
+        <w:t xml:space="preserve"> 37, 48 &amp; 64</w:t>
+      </w:r>
+    </w:p>
+    <w:p>
+      <w:pPr>
+        <w:tabs>
+          <w:tab w:val="right" w:pos="8931"/>
+        </w:tabs>
+        <w:rPr>
+          <w:lang w:val="de-DE" w:eastAsia="de-DE"/>
+        </w:rPr>
+      </w:pPr>
+      <w:proofErr w:type="spellStart"/>
+      <w:r>
+        <w:rPr>
+          <w:lang w:val="de-DE" w:eastAsia="de-DE"/>
+        </w:rPr>
+        <w:t>Desktiop</w:t>
+      </w:r>
+      <w:proofErr w:type="spellEnd"/>
+      <w:r>
+        <w:rPr>
+          <w:lang w:val="de-DE" w:eastAsia="de-DE"/>
+        </w:rPr>
+        <w:t xml:space="preserve"> mit vier Spalten, Tablet mit zwei Spalten:</w:t>
+      </w:r>
+      <w:r>
+        <w:rPr>
+          <w:lang w:val="de-DE" w:eastAsia="de-DE"/>
+        </w:rPr>
+        <w:tab/>
+        <w:t xml:space="preserve">Sheet _ </w:t>
+      </w:r>
+      <w:r>
+        <w:rPr>
+          <w:highlight w:val="yellow"/>
+          <w:lang w:val="de-DE" w:eastAsia="de-DE"/>
+        </w:rPr>
+        <w:t xml:space="preserve">Zeile </w:t>
+      </w:r>
+      <w:r>
+        <w:rPr>
+          <w:lang w:val="de-DE" w:eastAsia="de-DE"/>
+        </w:rPr>
+        <w:t>_</w:t>
       </w:r>
     </w:p>
     <w:p>
@@ -1107,17 +1232,19 @@
       <w:pPr>
         <w:pStyle w:val="berschrift3"/>
         <w:rPr>
-          <w:lang w:val="de-DE" w:eastAsia="de-DE"/>
+          <w:lang w:val="en-US" w:eastAsia="de-DE"/>
         </w:rPr>
       </w:pPr>
       <w:bookmarkStart w:id="5" w:name="_Toc229952182"/>
-      <w:r>
-        <w:rPr>
-          <w:lang w:val="de-DE" w:eastAsia="de-DE"/>
+      <w:proofErr w:type="spellStart"/>
+      <w:r>
+        <w:rPr>
+          <w:lang w:val="en-US" w:eastAsia="de-DE"/>
         </w:rPr>
         <w:t>Elemente</w:t>
       </w:r>
       <w:bookmarkEnd w:id="5"/>
+      <w:proofErr w:type="spellEnd"/>
     </w:p>
     <w:p>
       <w:pPr>
@@ -1133,19 +1260,20 @@
         <w:rPr>
           <w:lang w:val="en-US" w:eastAsia="de-DE"/>
         </w:rPr>
-        <w:t>C</w:t>
+        <w:t>Card:</w:t>
       </w:r>
       <w:r>
         <w:rPr>
           <w:lang w:val="en-US" w:eastAsia="de-DE"/>
         </w:rPr>
-        <w:t>ard</w:t>
+        <w:tab/>
+        <w:t xml:space="preserve">Sheet </w:t>
       </w:r>
       <w:r>
         <w:rPr>
           <w:lang w:val="en-US" w:eastAsia="de-DE"/>
         </w:rPr>
-        <w:t>:</w:t>
+        <w:t>contact.html</w:t>
       </w:r>
       <w:r>
         <w:rPr>
@@ -1155,33 +1283,16 @@
       </w:r>
       <w:r>
         <w:rPr>
+          <w:highlight w:val="yellow"/>
           <w:lang w:val="en-US" w:eastAsia="de-DE"/>
         </w:rPr>
-        <w:t xml:space="preserve">Sheet </w:t>
+        <w:t xml:space="preserve">Zeilen </w:t>
       </w:r>
       <w:r>
         <w:rPr>
           <w:lang w:val="en-US" w:eastAsia="de-DE"/>
         </w:rPr>
-        <w:t>contact.html</w:t>
-      </w:r>
-      <w:r>
-        <w:rPr>
-          <w:lang w:val="en-US" w:eastAsia="de-DE"/>
-        </w:rPr>
-        <w:tab/>
-      </w:r>
-      <w:r>
-        <w:rPr>
-          <w:lang w:val="en-US" w:eastAsia="de-DE"/>
-        </w:rPr>
-        <w:t>Zeile</w:t>
-      </w:r>
-      <w:r>
-        <w:rPr>
-          <w:lang w:val="en-US" w:eastAsia="de-DE"/>
-        </w:rPr>
-        <w:t>n 39 und 69</w:t>
+        <w:t>39 und 69</w:t>
       </w:r>
     </w:p>
     <w:p>
@@ -1198,40 +1309,30 @@
         <w:rPr>
           <w:lang w:val="en-US" w:eastAsia="de-DE"/>
         </w:rPr>
-        <w:t>M</w:t>
+        <w:t>Modal window:</w:t>
       </w:r>
       <w:r>
         <w:rPr>
           <w:lang w:val="en-US" w:eastAsia="de-DE"/>
         </w:rPr>
-        <w:t>odal window:</w:t>
+        <w:tab/>
+        <w:t>Sheet</w:t>
       </w:r>
       <w:r>
         <w:rPr>
           <w:lang w:val="en-US" w:eastAsia="de-DE"/>
         </w:rPr>
+        <w:t xml:space="preserve"> </w:t>
+      </w:r>
+      <w:r>
+        <w:rPr>
+          <w:lang w:val="en-US" w:eastAsia="de-DE"/>
+        </w:rPr>
         <w:tab/>
       </w:r>
       <w:r>
         <w:rPr>
-          <w:lang w:val="en-US" w:eastAsia="de-DE"/>
-        </w:rPr>
-        <w:t>Sheet</w:t>
-      </w:r>
-      <w:r>
-        <w:rPr>
-          <w:lang w:val="en-US" w:eastAsia="de-DE"/>
-        </w:rPr>
-        <w:t xml:space="preserve"> </w:t>
-      </w:r>
-      <w:r>
-        <w:rPr>
-          <w:lang w:val="en-US" w:eastAsia="de-DE"/>
-        </w:rPr>
-        <w:tab/>
-      </w:r>
-      <w:r>
-        <w:rPr>
+          <w:highlight w:val="yellow"/>
           <w:lang w:val="en-US" w:eastAsia="de-DE"/>
         </w:rPr>
         <w:t>Zeile</w:t>
@@ -1251,13 +1352,7 @@
         <w:rPr>
           <w:lang w:val="en-US" w:eastAsia="de-DE"/>
         </w:rPr>
-        <w:t>A</w:t>
-      </w:r>
-      <w:r>
-        <w:rPr>
-          <w:lang w:val="en-US" w:eastAsia="de-DE"/>
-        </w:rPr>
-        <w:t>ccordion:</w:t>
+        <w:t>Accordion:</w:t>
       </w:r>
       <w:r>
         <w:rPr>
@@ -1274,9 +1369,16 @@
       </w:r>
       <w:r>
         <w:rPr>
+          <w:highlight w:val="yellow"/>
           <w:lang w:val="en-US" w:eastAsia="de-DE"/>
         </w:rPr>
-        <w:t>Zeile 105</w:t>
+        <w:t xml:space="preserve">Zeile </w:t>
+      </w:r>
+      <w:r>
+        <w:rPr>
+          <w:lang w:val="en-US" w:eastAsia="de-DE"/>
+        </w:rPr>
+        <w:t>105</w:t>
       </w:r>
     </w:p>
     <w:p>
@@ -1286,44 +1388,81 @@
           <w:tab w:val="left" w:pos="6237"/>
         </w:tabs>
         <w:rPr>
+          <w:sz w:val="20"/>
+          <w:szCs w:val="20"/>
           <w:lang w:eastAsia="de-DE"/>
         </w:rPr>
       </w:pPr>
       <w:r>
         <w:rPr>
-          <w:lang w:val="de-DE" w:eastAsia="de-DE"/>
-        </w:rPr>
-        <w:t>Bild auf dem Text steht</w:t>
-      </w:r>
-      <w:r>
-        <w:rPr>
-          <w:lang w:val="de-DE" w:eastAsia="de-DE"/>
-        </w:rPr>
-        <w:t>:</w:t>
-      </w:r>
-      <w:r>
-        <w:rPr>
-          <w:lang w:val="de-DE" w:eastAsia="de-DE"/>
-        </w:rPr>
-        <w:tab/>
-      </w:r>
-      <w:r>
-        <w:rPr>
+          <w:sz w:val="20"/>
+          <w:szCs w:val="20"/>
           <w:lang w:eastAsia="de-DE"/>
         </w:rPr>
-        <w:t xml:space="preserve">Sheet </w:t>
-      </w:r>
-      <w:r>
-        <w:rPr>
+        <w:t xml:space="preserve">Beim </w:t>
+      </w:r>
+      <w:proofErr w:type="spellStart"/>
+      <w:r>
+        <w:rPr>
+          <w:sz w:val="20"/>
+          <w:szCs w:val="20"/>
           <w:lang w:eastAsia="de-DE"/>
         </w:rPr>
-        <w:tab/>
-      </w:r>
-      <w:r>
-        <w:rPr>
+        <w:t>Accordion</w:t>
+      </w:r>
+      <w:proofErr w:type="spellEnd"/>
+      <w:r>
+        <w:rPr>
+          <w:sz w:val="20"/>
+          <w:szCs w:val="20"/>
           <w:lang w:eastAsia="de-DE"/>
         </w:rPr>
-        <w:t>Zeile</w:t>
+        <w:t xml:space="preserve"> erstellten wird das Java</w:t>
+      </w:r>
+      <w:r>
+        <w:rPr>
+          <w:sz w:val="20"/>
+          <w:szCs w:val="20"/>
+          <w:lang w:eastAsia="de-DE"/>
+        </w:rPr>
+        <w:t xml:space="preserve"> </w:t>
+      </w:r>
+      <w:proofErr w:type="spellStart"/>
+      <w:r>
+        <w:rPr>
+          <w:sz w:val="20"/>
+          <w:szCs w:val="20"/>
+          <w:lang w:eastAsia="de-DE"/>
+        </w:rPr>
+        <w:t>Script</w:t>
+      </w:r>
+      <w:proofErr w:type="spellEnd"/>
+      <w:r>
+        <w:rPr>
+          <w:sz w:val="20"/>
+          <w:szCs w:val="20"/>
+          <w:lang w:eastAsia="de-DE"/>
+        </w:rPr>
+        <w:t xml:space="preserve"> mit </w:t>
+      </w:r>
+      <w:hyperlink r:id="rId10" w:history="1">
+        <w:r>
+          <w:rPr>
+            <w:rStyle w:val="Hyperlink"/>
+            <w:sz w:val="20"/>
+            <w:szCs w:val="20"/>
+            <w:lang w:eastAsia="de-DE"/>
+          </w:rPr>
+          <w:t>Gemini</w:t>
+        </w:r>
+      </w:hyperlink>
+      <w:r>
+        <w:rPr>
+          <w:sz w:val="20"/>
+          <w:szCs w:val="20"/>
+          <w:lang w:eastAsia="de-DE"/>
+        </w:rPr>
+        <w:t>.</w:t>
       </w:r>
     </w:p>
     <w:p>
@@ -1333,7 +1472,55 @@
           <w:tab w:val="left" w:pos="6237"/>
         </w:tabs>
         <w:rPr>
-          <w:lang w:val="de-DE" w:eastAsia="de-DE"/>
+          <w:lang w:eastAsia="de-DE"/>
+        </w:rPr>
+      </w:pPr>
+      <w:r>
+        <w:rPr>
+          <w:lang w:val="de-DE" w:eastAsia="de-DE"/>
+        </w:rPr>
+        <w:t>Bild auf dem Text steht</w:t>
+      </w:r>
+      <w:r>
+        <w:rPr>
+          <w:lang w:val="de-DE" w:eastAsia="de-DE"/>
+        </w:rPr>
+        <w:t>:</w:t>
+      </w:r>
+      <w:r>
+        <w:rPr>
+          <w:lang w:val="de-DE" w:eastAsia="de-DE"/>
+        </w:rPr>
+        <w:tab/>
+      </w:r>
+      <w:r>
+        <w:rPr>
+          <w:lang w:eastAsia="de-DE"/>
+        </w:rPr>
+        <w:t xml:space="preserve">Sheet </w:t>
+      </w:r>
+      <w:r>
+        <w:rPr>
+          <w:lang w:eastAsia="de-DE"/>
+        </w:rPr>
+        <w:tab/>
+      </w:r>
+      <w:r>
+        <w:rPr>
+          <w:highlight w:val="yellow"/>
+          <w:lang w:eastAsia="de-DE"/>
+        </w:rPr>
+        <w:t>Zeile</w:t>
+      </w:r>
+    </w:p>
+    <w:p>
+      <w:pPr>
+        <w:tabs>
+          <w:tab w:val="left" w:pos="3686"/>
+          <w:tab w:val="left" w:pos="6237"/>
+        </w:tabs>
+        <w:rPr>
+          <w:lang w:eastAsia="de-DE"/>
         </w:rPr>
       </w:pPr>
       <w:r>
@@ -1362,117 +1549,181 @@
       </w:r>
       <w:r>
         <w:rPr>
-          <w:lang w:val="en-US" w:eastAsia="de-DE"/>
+          <w:lang w:eastAsia="de-DE"/>
         </w:rPr>
         <w:t xml:space="preserve">Sheet </w:t>
       </w:r>
       <w:r>
         <w:rPr>
-          <w:lang w:val="en-US" w:eastAsia="de-DE"/>
+          <w:lang w:eastAsia="de-DE"/>
         </w:rPr>
         <w:t>contact.html</w:t>
       </w:r>
       <w:r>
         <w:rPr>
-          <w:lang w:val="en-US" w:eastAsia="de-DE"/>
+          <w:lang w:eastAsia="de-DE"/>
         </w:rPr>
         <w:tab/>
       </w:r>
       <w:r>
         <w:rPr>
-          <w:lang w:val="en-US" w:eastAsia="de-DE"/>
+          <w:highlight w:val="yellow"/>
+          <w:lang w:eastAsia="de-DE"/>
+        </w:rPr>
+        <w:t xml:space="preserve">Zeile </w:t>
+      </w:r>
+      <w:r>
+        <w:rPr>
+          <w:lang w:eastAsia="de-DE"/>
+        </w:rPr>
+        <w:t>60</w:t>
+      </w:r>
+      <w:bookmarkStart w:id="6" w:name="_Toc229952183"/>
+    </w:p>
+    <w:p>
+      <w:pPr>
+        <w:tabs>
+          <w:tab w:val="left" w:pos="3686"/>
+          <w:tab w:val="left" w:pos="6237"/>
+        </w:tabs>
+        <w:rPr>
+          <w:lang w:eastAsia="de-DE"/>
+        </w:rPr>
+      </w:pPr>
+    </w:p>
+    <w:p>
+      <w:pPr>
+        <w:pStyle w:val="berschrift3"/>
+      </w:pPr>
+      <w:r>
+        <w:t>Multimedia Inhalte</w:t>
+      </w:r>
+      <w:bookmarkStart w:id="7" w:name="_Toc229952184"/>
+      <w:bookmarkEnd w:id="6"/>
+    </w:p>
+    <w:p>
+      <w:r>
+        <w:t xml:space="preserve">Das Video integrierten wir auf dem Sheet index.html auf der </w:t>
+      </w:r>
+      <w:r>
+        <w:rPr>
+          <w:highlight w:val="yellow"/>
         </w:rPr>
         <w:t>Zeile</w:t>
       </w:r>
       <w:r>
-        <w:rPr>
-          <w:lang w:val="en-US" w:eastAsia="de-DE"/>
-        </w:rPr>
-        <w:t xml:space="preserve"> </w:t>
-      </w:r>
-      <w:r>
-        <w:rPr>
-          <w:lang w:val="en-US" w:eastAsia="de-DE"/>
-        </w:rPr>
-        <w:t>60</w:t>
-      </w:r>
-      <w:r>
-        <w:rPr>
-          <w:lang w:val="en-US" w:eastAsia="de-DE"/>
-        </w:rPr>
-        <w:tab/>
-      </w:r>
-    </w:p>
-    <w:p>
-      <w:pPr>
-        <w:pStyle w:val="berschrift1"/>
-      </w:pPr>
-      <w:bookmarkStart w:id="6" w:name="_Toc229952183"/>
+        <w:t xml:space="preserve"> 38</w:t>
+      </w:r>
+    </w:p>
+    <w:p/>
+    <w:p>
+      <w:pPr>
+        <w:pStyle w:val="berschrift3"/>
+      </w:pPr>
+      <w:r>
+        <w:t>Struktur</w:t>
+      </w:r>
+      <w:bookmarkStart w:id="8" w:name="_Toc229952185"/>
+      <w:bookmarkEnd w:id="7"/>
+    </w:p>
+    <w:p>
+      <w:r>
+        <w:t>(Kommentare)</w:t>
+      </w:r>
+    </w:p>
+    <w:p>
+      <w:r>
+        <w:t xml:space="preserve">Den Titel und das Favicon befinden sich jeweils auf </w:t>
+      </w:r>
+      <w:r>
+        <w:rPr>
+          <w:highlight w:val="yellow"/>
+        </w:rPr>
+        <w:t>Zeile</w:t>
+      </w:r>
+      <w:r>
+        <w:t xml:space="preserve"> 11 und 13</w:t>
+      </w:r>
+    </w:p>
+    <w:p>
+      <w:r>
+        <w:t>Zusätzlich erstellten wir verschiedene Ordner für:</w:t>
+      </w:r>
+    </w:p>
+    <w:p>
+      <w:pPr>
+        <w:pStyle w:val="Listenabsatz"/>
+        <w:numPr>
+          <w:ilvl w:val="0"/>
+          <w:numId w:val="2"/>
+        </w:numPr>
+      </w:pPr>
+      <w:r>
+        <w:t>HTML</w:t>
+      </w:r>
+    </w:p>
+    <w:p>
+      <w:pPr>
+        <w:pStyle w:val="Listenabsatz"/>
+        <w:numPr>
+          <w:ilvl w:val="0"/>
+          <w:numId w:val="2"/>
+        </w:numPr>
+      </w:pPr>
+      <w:r>
+        <w:t>CSS</w:t>
+      </w:r>
+    </w:p>
+    <w:p>
+      <w:pPr>
+        <w:pStyle w:val="Listenabsatz"/>
+        <w:numPr>
+          <w:ilvl w:val="0"/>
+          <w:numId w:val="2"/>
+        </w:numPr>
+      </w:pPr>
+      <w:r>
+        <w:t>Images</w:t>
+      </w:r>
+    </w:p>
+    <w:p>
+      <w:pPr>
+        <w:pStyle w:val="Listenabsatz"/>
+        <w:numPr>
+          <w:ilvl w:val="0"/>
+          <w:numId w:val="2"/>
+        </w:numPr>
+      </w:pPr>
       <w:r>
         <w:lastRenderedPageBreak/>
-        <w:t>Multimedia Inhalte</w:t>
-      </w:r>
-      <w:bookmarkEnd w:id="6"/>
-    </w:p>
-    <w:p>
-      <w:pPr>
-        <w:rPr>
-          <w:lang w:val="de-DE" w:eastAsia="de-DE"/>
-        </w:rPr>
-      </w:pPr>
-    </w:p>
-    <w:p>
-      <w:pPr>
-        <w:pStyle w:val="berschrift1"/>
-      </w:pPr>
-      <w:bookmarkStart w:id="7" w:name="_Toc229952184"/>
-      <w:r>
-        <w:lastRenderedPageBreak/>
-        <w:t>Struktur</w:t>
-      </w:r>
-      <w:bookmarkEnd w:id="7"/>
-    </w:p>
-    <w:p>
-      <w:pPr>
-        <w:rPr>
-          <w:lang w:val="de-DE" w:eastAsia="de-DE"/>
-        </w:rPr>
-      </w:pPr>
-    </w:p>
-    <w:p>
-      <w:pPr>
-        <w:pStyle w:val="berschrift1"/>
-      </w:pPr>
-      <w:bookmarkStart w:id="8" w:name="_Toc229952185"/>
-      <w:r>
-        <w:lastRenderedPageBreak/>
+        <w:t>Videos</w:t>
+      </w:r>
+    </w:p>
+    <w:p/>
+    <w:p/>
+    <w:p>
+      <w:pPr>
+        <w:pStyle w:val="berschrift3"/>
+      </w:pPr>
+      <w:r>
         <w:t>Übergabehinweise</w:t>
       </w:r>
+      <w:bookmarkStart w:id="9" w:name="_Toc229952186"/>
       <w:bookmarkEnd w:id="8"/>
     </w:p>
-    <w:p>
-      <w:pPr>
-        <w:rPr>
-          <w:lang w:val="de-DE" w:eastAsia="de-DE"/>
-        </w:rPr>
-      </w:pPr>
-    </w:p>
-    <w:p>
-      <w:pPr>
-        <w:pStyle w:val="berschrift1"/>
-      </w:pPr>
-      <w:bookmarkStart w:id="9" w:name="_Toc229952186"/>
-      <w:r>
-        <w:rPr>
-          <w:lang w:val="de-CH"/>
-        </w:rPr>
-        <w:lastRenderedPageBreak/>
+    <w:p/>
+    <w:p>
+      <w:pPr>
+        <w:pStyle w:val="berschrift3"/>
+      </w:pPr>
+      <w:r>
         <w:t>Zukünftige Ausbaumöglichkeiten</w:t>
       </w:r>
       <w:bookmarkEnd w:id="9"/>
     </w:p>
+    <w:p/>
     <w:sectPr>
-      <w:footerReference w:type="default" r:id="rId10"/>
+      <w:footerReference w:type="default" r:id="rId11"/>
       <w:pgSz w:w="11906" w:h="16838"/>
       <w:pgMar w:top="1417" w:right="1417" w:bottom="1134" w:left="1417" w:header="708" w:footer="708" w:gutter="0"/>
       <w:pgNumType w:start="0"/>
@@ -1582,6 +1833,120 @@
 <file path=word/numbering.xml><?xml version="1.0" encoding="utf-8"?>
 <w:numbering xmlns:wpc="http://schemas.microsoft.com/office/word/2010/wordprocessingCanvas" xmlns:cx="http://schemas.microsoft.com/office/drawing/2014/chartex" xmlns:cx1="http://schemas.microsoft.com/office/drawing/2015/9/8/chartex" xmlns:cx2="http://schemas.microsoft.com/office/drawing/2015/10/21/chartex" xmlns:cx3="http://schemas.microsoft.com/office/drawing/2016/5/9/chartex" xmlns:cx4="http://schemas.microsoft.com/office/drawing/2016/5/10/chartex" xmlns:cx5="http://schemas.microsoft.com/office/drawing/2016/5/11/chartex" xmlns:cx6="http://schemas.microsoft.com/office/drawing/2016/5/12/chartex" xmlns:cx7="http://schemas.microsoft.com/office/drawing/2016/5/13/chartex" xmlns:cx8="http://schemas.microsoft.com/office/drawing/2016/5/14/chartex" xmlns:mc="http://schemas.openxmlformats.org/markup-compatibility/2006" xmlns:aink="http://schemas.microsoft.com/office/drawing/2016/ink" xmlns:am3d="http://schemas.microsoft.com/office/drawing/2017/model3d" xmlns:o="urn:schemas-microsoft-com:office:office" xmlns:oel="http://schemas.microsoft.com/office/2019/extlst" xmlns:r="http://schemas.openxmlformats.org/officeDocument/2006/relationships" xmlns:m="http://schemas.openxmlformats.org/officeDocument/2006/math" xmlns:v="urn:schemas-microsoft-com:vml" xmlns:wp14="http://schemas.microsoft.com/office/word/2010/wordprocessingDrawing" xmlns:wp="http://schemas.openxmlformats.org/drawingml/2006/wordprocessingDrawing" xmlns:w10="urn:schemas-microsoft-com:office:word" xmlns:w="http://schemas.openxmlformats.org/wordprocessingml/2006/main" xmlns:w14="http://schemas.microsoft.com/office/word/2010/wordml" xmlns:w15="http://schemas.microsoft.com/office/word/2012/wordml" xmlns:w16cex="http://schemas.microsoft.com/office/word/2018/wordml/cex" xmlns:w16cid="http://schemas.microsoft.com/office/word/2016/wordml/cid" xmlns:w16="http://schemas.microsoft.com/office/word/2018/wordml" xmlns:w16du="http://schemas.microsoft.com/office/word/2023/wordml/word16du" xmlns:w16sdtdh="http://schemas.microsoft.com/office/word/2020/wordml/sdtdatahash" xmlns:w16sdtfl="http://schemas.microsoft.com/office/word/2024/wordml/sdtformatlock" xmlns:w16se="http://schemas.microsoft.com/office/word/2015/wordml/symex" xmlns:wpg="http://schemas.microsoft.com/office/word/2010/wordprocessingGroup" xmlns:wpi="http://schemas.microsoft.com/office/word/2010/wordprocessingInk" xmlns:wne="http://schemas.microsoft.com/office/word/2006/wordml" xmlns:wps="http://schemas.microsoft.com/office/word/2010/wordprocessingShape" mc:Ignorable="w14 w15 w16se w16cid w16 w16cex w16sdtdh w16sdtfl w16du wp14">
   <w:abstractNum w:abstractNumId="0" w15:restartNumberingAfterBreak="0">
+    <w:nsid w:val="004F0774"/>
+    <w:multiLevelType w:val="hybridMultilevel"/>
+    <w:tmpl w:val="456CBC80"/>
+    <w:lvl w:ilvl="0" w:tplc="80C820FA">
+      <w:start w:val="1"/>
+      <w:numFmt w:val="bullet"/>
+      <w:lvlText w:val=""/>
+      <w:lvlJc w:val="left"/>
+      <w:pPr>
+        <w:ind w:left="720" w:hanging="360"/>
+      </w:pPr>
+      <w:rPr>
+        <w:rFonts w:ascii="Symbol" w:hAnsi="Symbol" w:hint="default"/>
+        <w:color w:val="auto"/>
+      </w:rPr>
+    </w:lvl>
+    <w:lvl w:ilvl="1" w:tplc="08070003" w:tentative="1">
+      <w:start w:val="1"/>
+      <w:numFmt w:val="bullet"/>
+      <w:lvlText w:val="o"/>
+      <w:lvlJc w:val="left"/>
+      <w:pPr>
+        <w:ind w:left="1440" w:hanging="360"/>
+      </w:pPr>
+      <w:rPr>
+        <w:rFonts w:ascii="Courier New" w:hAnsi="Courier New" w:cs="Courier New" w:hint="default"/>
+      </w:rPr>
+    </w:lvl>
+    <w:lvl w:ilvl="2" w:tplc="08070005" w:tentative="1">
+      <w:start w:val="1"/>
+      <w:numFmt w:val="bullet"/>
+      <w:lvlText w:val=""/>
+      <w:lvlJc w:val="left"/>
+      <w:pPr>
+        <w:ind w:left="2160" w:hanging="360"/>
+      </w:pPr>
+      <w:rPr>
+        <w:rFonts w:ascii="Wingdings" w:hAnsi="Wingdings" w:hint="default"/>
+      </w:rPr>
+    </w:lvl>
+    <w:lvl w:ilvl="3" w:tplc="08070001" w:tentative="1">
+      <w:start w:val="1"/>
+      <w:numFmt w:val="bullet"/>
+      <w:lvlText w:val=""/>
+      <w:lvlJc w:val="left"/>
+      <w:pPr>
+        <w:ind w:left="2880" w:hanging="360"/>
+      </w:pPr>
+      <w:rPr>
+        <w:rFonts w:ascii="Symbol" w:hAnsi="Symbol" w:hint="default"/>
+      </w:rPr>
+    </w:lvl>
+    <w:lvl w:ilvl="4" w:tplc="08070003" w:tentative="1">
+      <w:start w:val="1"/>
+      <w:numFmt w:val="bullet"/>
+      <w:lvlText w:val="o"/>
+      <w:lvlJc w:val="left"/>
+      <w:pPr>
+        <w:ind w:left="3600" w:hanging="360"/>
+      </w:pPr>
+      <w:rPr>
+        <w:rFonts w:ascii="Courier New" w:hAnsi="Courier New" w:cs="Courier New" w:hint="default"/>
+      </w:rPr>
+    </w:lvl>
+    <w:lvl w:ilvl="5" w:tplc="08070005" w:tentative="1">
+      <w:start w:val="1"/>
+      <w:numFmt w:val="bullet"/>
+      <w:lvlText w:val=""/>
+      <w:lvlJc w:val="left"/>
+      <w:pPr>
+        <w:ind w:left="4320" w:hanging="360"/>
+      </w:pPr>
+      <w:rPr>
+        <w:rFonts w:ascii="Wingdings" w:hAnsi="Wingdings" w:hint="default"/>
+      </w:rPr>
+    </w:lvl>
+    <w:lvl w:ilvl="6" w:tplc="08070001" w:tentative="1">
+      <w:start w:val="1"/>
+      <w:numFmt w:val="bullet"/>
+      <w:lvlText w:val=""/>
+      <w:lvlJc w:val="left"/>
+      <w:pPr>
+        <w:ind w:left="5040" w:hanging="360"/>
+      </w:pPr>
+      <w:rPr>
+        <w:rFonts w:ascii="Symbol" w:hAnsi="Symbol" w:hint="default"/>
+      </w:rPr>
+    </w:lvl>
+    <w:lvl w:ilvl="7" w:tplc="08070003" w:tentative="1">
+      <w:start w:val="1"/>
+      <w:numFmt w:val="bullet"/>
+      <w:lvlText w:val="o"/>
+      <w:lvlJc w:val="left"/>
+      <w:pPr>
+        <w:ind w:left="5760" w:hanging="360"/>
+      </w:pPr>
+      <w:rPr>
+        <w:rFonts w:ascii="Courier New" w:hAnsi="Courier New" w:cs="Courier New" w:hint="default"/>
+      </w:rPr>
+    </w:lvl>
+    <w:lvl w:ilvl="8" w:tplc="08070005" w:tentative="1">
+      <w:start w:val="1"/>
+      <w:numFmt w:val="bullet"/>
+      <w:lvlText w:val=""/>
+      <w:lvlJc w:val="left"/>
+      <w:pPr>
+        <w:ind w:left="6480" w:hanging="360"/>
+      </w:pPr>
+      <w:rPr>
+        <w:rFonts w:ascii="Wingdings" w:hAnsi="Wingdings" w:hint="default"/>
+      </w:rPr>
+    </w:lvl>
+  </w:abstractNum>
+  <w:abstractNum w:abstractNumId="1" w15:restartNumberingAfterBreak="0">
     <w:nsid w:val="2215430E"/>
     <w:multiLevelType w:val="multilevel"/>
     <w:tmpl w:val="81DC43B4"/>
@@ -1731,6 +2096,9 @@
     </w:lvl>
   </w:abstractNum>
   <w:num w:numId="1" w16cid:durableId="1463305545">
+    <w:abstractNumId w:val="1"/>
+  </w:num>
+  <w:num w:numId="2" w16cid:durableId="711735943">
     <w:abstractNumId w:val="0"/>
   </w:num>
 </w:numbering>
@@ -2336,6 +2704,7 @@
   <w:style w:type="character" w:default="1" w:styleId="Absatz-Standardschriftart">
     <w:name w:val="Default Paragraph Font"/>
     <w:uiPriority w:val="1"/>
+    <w:semiHidden/>
     <w:unhideWhenUsed/>
   </w:style>
   <w:style w:type="table" w:default="1" w:styleId="NormaleTabelle">

</xml_diff>

<commit_message>
joah nomal doku lowk
</commit_message>
<xml_diff>
--- a/docu/documentation_mma25b_bachmann_ottiger.docx
+++ b/docu/documentation_mma25b_bachmann_ottiger.docx
@@ -1715,7 +1715,24 @@
         <w:t>Zeile</w:t>
       </w:r>
       <w:r>
-        <w:t xml:space="preserve"> 38</w:t>
+        <w:t xml:space="preserve"> 3</w:t>
+      </w:r>
+      <w:r>
+        <w:t>4</w:t>
+      </w:r>
+    </w:p>
+    <w:p>
+      <w:r>
+        <w:t xml:space="preserve">Unser erstelltes Audio befindet sich auf dem Sheet contact.html auf der </w:t>
+      </w:r>
+      <w:r>
+        <w:rPr>
+          <w:highlight w:val="yellow"/>
+        </w:rPr>
+        <w:t>Zeile</w:t>
+      </w:r>
+      <w:r>
+        <w:t xml:space="preserve"> 59</w:t>
       </w:r>
     </w:p>
     <w:p>
@@ -1806,7 +1823,6 @@
         <w:t>Videos</w:t>
       </w:r>
     </w:p>
-    <w:p/>
     <w:p/>
     <w:p>
       <w:pPr>

</xml_diff>

<commit_message>
Selbstständigkeitsding gmacht und zusätzliche Quellen
</commit_message>
<xml_diff>
--- a/docu/documentation_mma25b_bachmann_ottiger.docx
+++ b/docu/documentation_mma25b_bachmann_ottiger.docx
@@ -138,7 +138,7 @@
           <w:r>
             <w:fldChar w:fldCharType="separate"/>
           </w:r>
-          <w:hyperlink w:anchor="_Toc230859407" w:history="1">
+          <w:hyperlink w:anchor="_Toc231154511" w:history="1">
             <w:r>
               <w:rPr>
                 <w:rStyle w:val="Hyperlink"/>
@@ -165,7 +165,7 @@
                 <w:noProof/>
                 <w:webHidden/>
               </w:rPr>
-              <w:instrText xml:space="preserve"> PAGEREF _Toc230859407 \h </w:instrText>
+              <w:instrText xml:space="preserve"> PAGEREF _Toc231154511 \h </w:instrText>
             </w:r>
             <w:r>
               <w:rPr>
@@ -211,7 +211,7 @@
               <w14:ligatures w14:val="standardContextual"/>
             </w:rPr>
           </w:pPr>
-          <w:hyperlink w:anchor="_Toc230859408" w:history="1">
+          <w:hyperlink w:anchor="_Toc231154512" w:history="1">
             <w:r>
               <w:rPr>
                 <w:rStyle w:val="Hyperlink"/>
@@ -238,7 +238,7 @@
                 <w:noProof/>
                 <w:webHidden/>
               </w:rPr>
-              <w:instrText xml:space="preserve"> PAGEREF _Toc230859408 \h </w:instrText>
+              <w:instrText xml:space="preserve"> PAGEREF _Toc231154512 \h </w:instrText>
             </w:r>
             <w:r>
               <w:rPr>
@@ -284,7 +284,7 @@
               <w14:ligatures w14:val="standardContextual"/>
             </w:rPr>
           </w:pPr>
-          <w:hyperlink w:anchor="_Toc230859409" w:history="1">
+          <w:hyperlink w:anchor="_Toc231154513" w:history="1">
             <w:r>
               <w:rPr>
                 <w:rStyle w:val="Hyperlink"/>
@@ -311,7 +311,7 @@
                 <w:noProof/>
                 <w:webHidden/>
               </w:rPr>
-              <w:instrText xml:space="preserve"> PAGEREF _Toc230859409 \h </w:instrText>
+              <w:instrText xml:space="preserve"> PAGEREF _Toc231154513 \h </w:instrText>
             </w:r>
             <w:r>
               <w:rPr>
@@ -357,7 +357,7 @@
               <w14:ligatures w14:val="standardContextual"/>
             </w:rPr>
           </w:pPr>
-          <w:hyperlink w:anchor="_Toc230859410" w:history="1">
+          <w:hyperlink w:anchor="_Toc231154514" w:history="1">
             <w:r>
               <w:rPr>
                 <w:rStyle w:val="Hyperlink"/>
@@ -384,7 +384,7 @@
                 <w:noProof/>
                 <w:webHidden/>
               </w:rPr>
-              <w:instrText xml:space="preserve"> PAGEREF _Toc230859410 \h </w:instrText>
+              <w:instrText xml:space="preserve"> PAGEREF _Toc231154514 \h </w:instrText>
             </w:r>
             <w:r>
               <w:rPr>
@@ -430,7 +430,7 @@
               <w14:ligatures w14:val="standardContextual"/>
             </w:rPr>
           </w:pPr>
-          <w:hyperlink w:anchor="_Toc230859411" w:history="1">
+          <w:hyperlink w:anchor="_Toc231154515" w:history="1">
             <w:r>
               <w:rPr>
                 <w:rStyle w:val="Hyperlink"/>
@@ -458,7 +458,7 @@
                 <w:noProof/>
                 <w:webHidden/>
               </w:rPr>
-              <w:instrText xml:space="preserve"> PAGEREF _Toc230859411 \h </w:instrText>
+              <w:instrText xml:space="preserve"> PAGEREF _Toc231154515 \h </w:instrText>
             </w:r>
             <w:r>
               <w:rPr>
@@ -504,7 +504,7 @@
               <w14:ligatures w14:val="standardContextual"/>
             </w:rPr>
           </w:pPr>
-          <w:hyperlink w:anchor="_Toc230859412" w:history="1">
+          <w:hyperlink w:anchor="_Toc231154516" w:history="1">
             <w:r>
               <w:rPr>
                 <w:rStyle w:val="Hyperlink"/>
@@ -532,7 +532,7 @@
                 <w:noProof/>
                 <w:webHidden/>
               </w:rPr>
-              <w:instrText xml:space="preserve"> PAGEREF _Toc230859412 \h </w:instrText>
+              <w:instrText xml:space="preserve"> PAGEREF _Toc231154516 \h </w:instrText>
             </w:r>
             <w:r>
               <w:rPr>
@@ -578,7 +578,7 @@
               <w14:ligatures w14:val="standardContextual"/>
             </w:rPr>
           </w:pPr>
-          <w:hyperlink w:anchor="_Toc230859413" w:history="1">
+          <w:hyperlink w:anchor="_Toc231154517" w:history="1">
             <w:r>
               <w:rPr>
                 <w:rStyle w:val="Hyperlink"/>
@@ -605,7 +605,7 @@
                 <w:noProof/>
                 <w:webHidden/>
               </w:rPr>
-              <w:instrText xml:space="preserve"> PAGEREF _Toc230859413 \h </w:instrText>
+              <w:instrText xml:space="preserve"> PAGEREF _Toc231154517 \h </w:instrText>
             </w:r>
             <w:r>
               <w:rPr>
@@ -651,7 +651,7 @@
               <w14:ligatures w14:val="standardContextual"/>
             </w:rPr>
           </w:pPr>
-          <w:hyperlink w:anchor="_Toc230859414" w:history="1">
+          <w:hyperlink w:anchor="_Toc231154518" w:history="1">
             <w:r>
               <w:rPr>
                 <w:rStyle w:val="Hyperlink"/>
@@ -678,7 +678,7 @@
                 <w:noProof/>
                 <w:webHidden/>
               </w:rPr>
-              <w:instrText xml:space="preserve"> PAGEREF _Toc230859414 \h </w:instrText>
+              <w:instrText xml:space="preserve"> PAGEREF _Toc231154518 \h </w:instrText>
             </w:r>
             <w:r>
               <w:rPr>
@@ -724,7 +724,7 @@
               <w14:ligatures w14:val="standardContextual"/>
             </w:rPr>
           </w:pPr>
-          <w:hyperlink w:anchor="_Toc230859415" w:history="1">
+          <w:hyperlink w:anchor="_Toc231154519" w:history="1">
             <w:r>
               <w:rPr>
                 <w:rStyle w:val="Hyperlink"/>
@@ -751,7 +751,7 @@
                 <w:noProof/>
                 <w:webHidden/>
               </w:rPr>
-              <w:instrText xml:space="preserve"> PAGEREF _Toc230859415 \h </w:instrText>
+              <w:instrText xml:space="preserve"> PAGEREF _Toc231154519 \h </w:instrText>
             </w:r>
             <w:r>
               <w:rPr>
@@ -797,7 +797,7 @@
               <w14:ligatures w14:val="standardContextual"/>
             </w:rPr>
           </w:pPr>
-          <w:hyperlink w:anchor="_Toc230859416" w:history="1">
+          <w:hyperlink w:anchor="_Toc231154520" w:history="1">
             <w:r>
               <w:rPr>
                 <w:rStyle w:val="Hyperlink"/>
@@ -824,7 +824,7 @@
                 <w:noProof/>
                 <w:webHidden/>
               </w:rPr>
-              <w:instrText xml:space="preserve"> PAGEREF _Toc230859416 \h </w:instrText>
+              <w:instrText xml:space="preserve"> PAGEREF _Toc231154520 \h </w:instrText>
             </w:r>
             <w:r>
               <w:rPr>
@@ -870,7 +870,7 @@
               <w14:ligatures w14:val="standardContextual"/>
             </w:rPr>
           </w:pPr>
-          <w:hyperlink w:anchor="_Toc230859417" w:history="1">
+          <w:hyperlink w:anchor="_Toc231154521" w:history="1">
             <w:r>
               <w:rPr>
                 <w:rStyle w:val="Hyperlink"/>
@@ -897,7 +897,7 @@
                 <w:noProof/>
                 <w:webHidden/>
               </w:rPr>
-              <w:instrText xml:space="preserve"> PAGEREF _Toc230859417 \h </w:instrText>
+              <w:instrText xml:space="preserve"> PAGEREF _Toc231154521 \h </w:instrText>
             </w:r>
             <w:r>
               <w:rPr>
@@ -918,6 +918,225 @@
                 <w:webHidden/>
               </w:rPr>
               <w:t>4</w:t>
+            </w:r>
+            <w:r>
+              <w:rPr>
+                <w:noProof/>
+                <w:webHidden/>
+              </w:rPr>
+              <w:fldChar w:fldCharType="end"/>
+            </w:r>
+          </w:hyperlink>
+        </w:p>
+        <w:p>
+          <w:pPr>
+            <w:pStyle w:val="Verzeichnis3"/>
+            <w:tabs>
+              <w:tab w:val="right" w:leader="dot" w:pos="9062"/>
+            </w:tabs>
+            <w:rPr>
+              <w:rFonts w:cstheme="minorBidi"/>
+              <w:noProof/>
+              <w:kern w:val="2"/>
+              <w:sz w:val="24"/>
+              <w:szCs w:val="24"/>
+              <w14:ligatures w14:val="standardContextual"/>
+            </w:rPr>
+          </w:pPr>
+          <w:hyperlink w:anchor="_Toc231154522" w:history="1">
+            <w:r>
+              <w:rPr>
+                <w:rStyle w:val="Hyperlink"/>
+                <w:noProof/>
+              </w:rPr>
+              <w:t>Lessons Learned</w:t>
+            </w:r>
+            <w:r>
+              <w:rPr>
+                <w:noProof/>
+                <w:webHidden/>
+              </w:rPr>
+              <w:tab/>
+            </w:r>
+            <w:r>
+              <w:rPr>
+                <w:noProof/>
+                <w:webHidden/>
+              </w:rPr>
+              <w:fldChar w:fldCharType="begin"/>
+            </w:r>
+            <w:r>
+              <w:rPr>
+                <w:noProof/>
+                <w:webHidden/>
+              </w:rPr>
+              <w:instrText xml:space="preserve"> PAGEREF _Toc231154522 \h </w:instrText>
+            </w:r>
+            <w:r>
+              <w:rPr>
+                <w:noProof/>
+                <w:webHidden/>
+              </w:rPr>
+            </w:r>
+            <w:r>
+              <w:rPr>
+                <w:noProof/>
+                <w:webHidden/>
+              </w:rPr>
+              <w:fldChar w:fldCharType="separate"/>
+            </w:r>
+            <w:r>
+              <w:rPr>
+                <w:noProof/>
+                <w:webHidden/>
+              </w:rPr>
+              <w:t>4</w:t>
+            </w:r>
+            <w:r>
+              <w:rPr>
+                <w:noProof/>
+                <w:webHidden/>
+              </w:rPr>
+              <w:fldChar w:fldCharType="end"/>
+            </w:r>
+          </w:hyperlink>
+        </w:p>
+        <w:p>
+          <w:pPr>
+            <w:pStyle w:val="Verzeichnis3"/>
+            <w:tabs>
+              <w:tab w:val="right" w:leader="dot" w:pos="9062"/>
+            </w:tabs>
+            <w:rPr>
+              <w:rFonts w:cstheme="minorBidi"/>
+              <w:noProof/>
+              <w:kern w:val="2"/>
+              <w:sz w:val="24"/>
+              <w:szCs w:val="24"/>
+              <w14:ligatures w14:val="standardContextual"/>
+            </w:rPr>
+          </w:pPr>
+          <w:hyperlink w:anchor="_Toc231154523" w:history="1">
+            <w:r>
+              <w:rPr>
+                <w:rStyle w:val="Hyperlink"/>
+                <w:noProof/>
+              </w:rPr>
+              <w:t>Selbstständigkeitserklärung</w:t>
+            </w:r>
+            <w:r>
+              <w:rPr>
+                <w:noProof/>
+                <w:webHidden/>
+              </w:rPr>
+              <w:tab/>
+            </w:r>
+            <w:r>
+              <w:rPr>
+                <w:noProof/>
+                <w:webHidden/>
+              </w:rPr>
+              <w:fldChar w:fldCharType="begin"/>
+            </w:r>
+            <w:r>
+              <w:rPr>
+                <w:noProof/>
+                <w:webHidden/>
+              </w:rPr>
+              <w:instrText xml:space="preserve"> PAGEREF _Toc231154523 \h </w:instrText>
+            </w:r>
+            <w:r>
+              <w:rPr>
+                <w:noProof/>
+                <w:webHidden/>
+              </w:rPr>
+            </w:r>
+            <w:r>
+              <w:rPr>
+                <w:noProof/>
+                <w:webHidden/>
+              </w:rPr>
+              <w:fldChar w:fldCharType="separate"/>
+            </w:r>
+            <w:r>
+              <w:rPr>
+                <w:noProof/>
+                <w:webHidden/>
+              </w:rPr>
+              <w:t>5</w:t>
+            </w:r>
+            <w:r>
+              <w:rPr>
+                <w:noProof/>
+                <w:webHidden/>
+              </w:rPr>
+              <w:fldChar w:fldCharType="end"/>
+            </w:r>
+          </w:hyperlink>
+        </w:p>
+        <w:p>
+          <w:pPr>
+            <w:pStyle w:val="Verzeichnis3"/>
+            <w:tabs>
+              <w:tab w:val="right" w:leader="dot" w:pos="9062"/>
+            </w:tabs>
+            <w:rPr>
+              <w:rFonts w:cstheme="minorBidi"/>
+              <w:noProof/>
+              <w:kern w:val="2"/>
+              <w:sz w:val="24"/>
+              <w:szCs w:val="24"/>
+              <w14:ligatures w14:val="standardContextual"/>
+            </w:rPr>
+          </w:pPr>
+          <w:hyperlink w:anchor="_Toc231154524" w:history="1">
+            <w:r>
+              <w:rPr>
+                <w:rStyle w:val="Hyperlink"/>
+                <w:noProof/>
+              </w:rPr>
+              <w:t>Quellen</w:t>
+            </w:r>
+            <w:r>
+              <w:rPr>
+                <w:noProof/>
+                <w:webHidden/>
+              </w:rPr>
+              <w:tab/>
+            </w:r>
+            <w:r>
+              <w:rPr>
+                <w:noProof/>
+                <w:webHidden/>
+              </w:rPr>
+              <w:fldChar w:fldCharType="begin"/>
+            </w:r>
+            <w:r>
+              <w:rPr>
+                <w:noProof/>
+                <w:webHidden/>
+              </w:rPr>
+              <w:instrText xml:space="preserve"> PAGEREF _Toc231154524 \h </w:instrText>
+            </w:r>
+            <w:r>
+              <w:rPr>
+                <w:noProof/>
+                <w:webHidden/>
+              </w:rPr>
+            </w:r>
+            <w:r>
+              <w:rPr>
+                <w:noProof/>
+                <w:webHidden/>
+              </w:rPr>
+              <w:fldChar w:fldCharType="separate"/>
+            </w:r>
+            <w:r>
+              <w:rPr>
+                <w:noProof/>
+                <w:webHidden/>
+              </w:rPr>
+              <w:t>5</w:t>
             </w:r>
             <w:r>
               <w:rPr>
@@ -955,7 +1174,7 @@
       <w:pPr>
         <w:pStyle w:val="berschrift2"/>
       </w:pPr>
-      <w:bookmarkStart w:id="0" w:name="_Toc230859407"/>
+      <w:bookmarkStart w:id="0" w:name="_Toc231154511"/>
       <w:r>
         <w:lastRenderedPageBreak/>
         <w:t>Seiten</w:t>
@@ -1014,7 +1233,7 @@
       <w:pPr>
         <w:pStyle w:val="berschrift2"/>
       </w:pPr>
-      <w:bookmarkStart w:id="1" w:name="_Toc230859408"/>
+      <w:bookmarkStart w:id="1" w:name="_Toc231154512"/>
       <w:r>
         <w:t>Eigenes CSS</w:t>
       </w:r>
@@ -1071,7 +1290,7 @@
       <w:pPr>
         <w:pStyle w:val="berschrift2"/>
       </w:pPr>
-      <w:bookmarkStart w:id="2" w:name="_Toc230859409"/>
+      <w:bookmarkStart w:id="2" w:name="_Toc231154513"/>
       <w:r>
         <w:t>Framework einbinden</w:t>
       </w:r>
@@ -1123,7 +1342,7 @@
       <w:pPr>
         <w:pStyle w:val="berschrift2"/>
       </w:pPr>
-      <w:bookmarkStart w:id="3" w:name="_Toc230859410"/>
+      <w:bookmarkStart w:id="3" w:name="_Toc231154514"/>
       <w:r>
         <w:t>Framework anwenden</w:t>
       </w:r>
@@ -1136,7 +1355,7 @@
           <w:lang w:val="de-DE" w:eastAsia="de-DE"/>
         </w:rPr>
       </w:pPr>
-      <w:bookmarkStart w:id="4" w:name="_Toc230859411"/>
+      <w:bookmarkStart w:id="4" w:name="_Toc231154515"/>
       <w:r>
         <w:rPr>
           <w:lang w:val="de-DE" w:eastAsia="de-DE"/>
@@ -1467,7 +1686,7 @@
           <w:lang w:eastAsia="de-DE"/>
         </w:rPr>
       </w:pPr>
-      <w:bookmarkStart w:id="5" w:name="_Toc230859412"/>
+      <w:bookmarkStart w:id="5" w:name="_Toc231154516"/>
       <w:r>
         <w:rPr>
           <w:lang w:eastAsia="de-DE"/>
@@ -1800,7 +2019,30 @@
                 <w:szCs w:val="18"/>
                 <w:lang w:eastAsia="de-DE"/>
               </w:rPr>
-              <w:t xml:space="preserve"> mit Gemini.</w:t>
+              <w:t xml:space="preserve"> mit </w:t>
+            </w:r>
+            <w:hyperlink r:id="rId10" w:history="1">
+              <w:r>
+                <w:rPr>
+                  <w:rStyle w:val="Hyperlink"/>
+                  <w:b w:val="0"/>
+                  <w:bCs w:val="0"/>
+                  <w:sz w:val="18"/>
+                  <w:szCs w:val="18"/>
+                  <w:lang w:eastAsia="de-DE"/>
+                </w:rPr>
+                <w:t>Gemini</w:t>
+              </w:r>
+            </w:hyperlink>
+            <w:r>
+              <w:rPr>
+                <w:b w:val="0"/>
+                <w:bCs w:val="0"/>
+                <w:sz w:val="18"/>
+                <w:szCs w:val="18"/>
+                <w:lang w:eastAsia="de-DE"/>
+              </w:rPr>
+              <w:t>.</w:t>
             </w:r>
           </w:p>
         </w:tc>
@@ -1985,7 +2227,7 @@
       <w:pPr>
         <w:pStyle w:val="berschrift3"/>
       </w:pPr>
-      <w:bookmarkStart w:id="6" w:name="_Toc230859413"/>
+      <w:bookmarkStart w:id="6" w:name="_Toc231154517"/>
       <w:r>
         <w:t>Multimedia Inhalte</w:t>
       </w:r>
@@ -2258,7 +2500,7 @@
       <w:pPr>
         <w:pStyle w:val="berschrift3"/>
       </w:pPr>
-      <w:bookmarkStart w:id="7" w:name="_Toc230859414"/>
+      <w:bookmarkStart w:id="7" w:name="_Toc231154518"/>
       <w:r>
         <w:lastRenderedPageBreak/>
         <w:t>Struktur</w:t>
@@ -2662,7 +2904,7 @@
                           <pic:cNvPicPr/>
                         </pic:nvPicPr>
                         <pic:blipFill>
-                          <a:blip r:embed="rId10"/>
+                          <a:blip r:embed="rId11"/>
                           <a:stretch>
                             <a:fillRect/>
                           </a:stretch>
@@ -2789,7 +3031,7 @@
       <w:pPr>
         <w:pStyle w:val="berschrift3"/>
       </w:pPr>
-      <w:bookmarkStart w:id="8" w:name="_Toc230859415"/>
+      <w:bookmarkStart w:id="8" w:name="_Toc231154519"/>
       <w:r>
         <w:t>Zusatz CSS Feature</w:t>
       </w:r>
@@ -2859,7 +3101,7 @@
       <w:pPr>
         <w:pStyle w:val="berschrift3"/>
       </w:pPr>
-      <w:bookmarkStart w:id="9" w:name="_Toc230859416"/>
+      <w:bookmarkStart w:id="9" w:name="_Toc231154520"/>
       <w:r>
         <w:lastRenderedPageBreak/>
         <w:t>Übergabehinweise</w:t>
@@ -2922,7 +3164,7 @@
       <w:pPr>
         <w:pStyle w:val="berschrift3"/>
       </w:pPr>
-      <w:bookmarkStart w:id="10" w:name="_Toc230859417"/>
+      <w:bookmarkStart w:id="10" w:name="_Toc231154521"/>
       <w:r>
         <w:t>Zukünftige Ausbaumöglichkeiten</w:t>
       </w:r>
@@ -2938,6 +3180,7 @@
       <w:pPr>
         <w:pStyle w:val="berschrift3"/>
       </w:pPr>
+      <w:bookmarkStart w:id="11" w:name="_Toc231154522"/>
       <w:proofErr w:type="spellStart"/>
       <w:r>
         <w:t>Lessons</w:t>
@@ -2946,6 +3189,7 @@
       <w:r>
         <w:t xml:space="preserve"> Learned</w:t>
       </w:r>
+      <w:bookmarkEnd w:id="11"/>
     </w:p>
     <w:p>
       <w:r>
@@ -2974,6 +3218,9 @@
       </w:r>
     </w:p>
     <w:p>
+      <w:pPr>
+        <w:spacing w:before="120"/>
+      </w:pPr>
       <w:r>
         <w:t xml:space="preserve">Beim Erstellen des </w:t>
       </w:r>
@@ -3000,9 +3247,370 @@
         <w:t>viel besser.</w:t>
       </w:r>
     </w:p>
+    <w:p>
+      <w:pPr>
+        <w:spacing w:before="120"/>
+      </w:pPr>
+      <w:r>
+        <w:t>Durch das Projekt haben wir gelernt, wie viel Zeit man mit einem CSS-Framework sparen kann. Anstatt jeden Button und jede Card komplett neu zu programmieren, konnten wir die fertigen Klassen von W3.CSS nutzen und mussten nur noch unsere Markenfarben anpassen.</w:t>
+      </w:r>
+    </w:p>
+    <w:p>
+      <w:pPr>
+        <w:spacing w:before="120"/>
+      </w:pPr>
+      <w:r>
+        <w:t xml:space="preserve">Wir haben gelernt, wie wichtig die richtige Ordnerstruktur und die relativen Pfade sind. Da unsere Seiten in verschiedenen Ordnern liegen, mussten wir genau aufpassen, wann </w:t>
+      </w:r>
+      <w:proofErr w:type="gramStart"/>
+      <w:r>
+        <w:t>wir .</w:t>
+      </w:r>
+      <w:proofErr w:type="gramEnd"/>
+      <w:r>
+        <w:t>/ und wann wir</w:t>
+      </w:r>
+      <w:proofErr w:type="gramStart"/>
+      <w:r>
+        <w:t xml:space="preserve"> ..</w:t>
+      </w:r>
+      <w:proofErr w:type="gramEnd"/>
+      <w:r>
+        <w:t>/ für die Verknüpfung von Bildern und CSS-Dateien verwenden.</w:t>
+      </w:r>
+    </w:p>
+    <w:p>
+      <w:pPr>
+        <w:spacing w:before="120"/>
+      </w:pPr>
+      <w:r>
+        <w:t>Wir sind methodisch so vorgegangen, dass wir die Aufgaben im Team aufgeteilt haben. Als Erstes definierten wir, wer welche HTML-Seite programmiert. Da Sarina die dritte Seite übernahm, habe ich</w:t>
+      </w:r>
+      <w:r>
+        <w:t>, Ria</w:t>
+      </w:r>
+      <w:r>
+        <w:t xml:space="preserve"> in dieser Zeit mit der Dokumentation begonnen. Durch diese Aufteilung konnten wir gleichzeitig arbeiten, ohne uns beim Schreiben des Codes gegenseitig zu blockieren.</w:t>
+      </w:r>
+    </w:p>
+    <w:p>
+      <w:pPr>
+        <w:spacing w:before="120"/>
+      </w:pPr>
+    </w:p>
+    <w:p>
+      <w:pPr>
+        <w:pStyle w:val="berschrift3"/>
+      </w:pPr>
+      <w:bookmarkStart w:id="12" w:name="_Toc231154523"/>
+      <w:r>
+        <w:lastRenderedPageBreak/>
+        <w:t>Selbstständigkeitserklärung</w:t>
+      </w:r>
+      <w:bookmarkEnd w:id="12"/>
+    </w:p>
+    <w:p>
+      <w:r>
+        <w:t>Wir, Sarina und Ria,</w:t>
+      </w:r>
+      <w:r>
+        <w:t xml:space="preserve"> </w:t>
+      </w:r>
+      <w:r>
+        <w:t>erklären</w:t>
+      </w:r>
+      <w:r>
+        <w:t xml:space="preserve"> hiermit die Webseite sowie die Dokumentation selbständig erstellt zu haben. </w:t>
+      </w:r>
+      <w:r>
+        <w:t>Wir</w:t>
+      </w:r>
+      <w:r>
+        <w:t xml:space="preserve"> habe</w:t>
+      </w:r>
+      <w:r>
+        <w:t>n</w:t>
+      </w:r>
+      <w:r>
+        <w:t xml:space="preserve"> die im Unterricht verwendeten Hilfsmittel sowie w3c </w:t>
+      </w:r>
+      <w:r>
+        <w:t>genutzt,</w:t>
+      </w:r>
+      <w:r>
+        <w:t xml:space="preserve"> um diese Webseite zu erstellen. Alle weiteren Quellen habe</w:t>
+      </w:r>
+      <w:r>
+        <w:t>n</w:t>
+      </w:r>
+      <w:r>
+        <w:t xml:space="preserve"> </w:t>
+      </w:r>
+      <w:r>
+        <w:t>wir</w:t>
+      </w:r>
+      <w:r>
+        <w:t xml:space="preserve"> angegeben.</w:t>
+      </w:r>
+    </w:p>
     <w:p/>
+    <w:p>
+      <w:pPr>
+        <w:pStyle w:val="berschrift3"/>
+      </w:pPr>
+      <w:bookmarkStart w:id="13" w:name="_Toc231154524"/>
+      <w:r>
+        <w:t>Quellen</w:t>
+      </w:r>
+      <w:bookmarkEnd w:id="13"/>
+    </w:p>
+    <w:p>
+      <w:r>
+        <w:t>Texte auf der Website:</w:t>
+      </w:r>
+    </w:p>
+    <w:p>
+      <w:hyperlink r:id="rId12" w:history="1">
+        <w:r>
+          <w:rPr>
+            <w:rStyle w:val="Hyperlink"/>
+          </w:rPr>
+          <w:t>Chat GPT</w:t>
+        </w:r>
+      </w:hyperlink>
+    </w:p>
+    <w:p/>
+    <w:p>
+      <w:r>
+        <w:t>Verwendete Bilder:</w:t>
+      </w:r>
+    </w:p>
+    <w:p>
+      <w:hyperlink r:id="rId13" w:history="1">
+        <w:r>
+          <w:rPr>
+            <w:rStyle w:val="Hyperlink"/>
+          </w:rPr>
+          <w:t>El Tony Mate</w:t>
+        </w:r>
+      </w:hyperlink>
+    </w:p>
+    <w:p>
+      <w:hyperlink r:id="rId14" w:history="1">
+        <w:proofErr w:type="spellStart"/>
+        <w:r>
+          <w:rPr>
+            <w:rStyle w:val="Hyperlink"/>
+          </w:rPr>
+          <w:t>Pixabay</w:t>
+        </w:r>
+        <w:proofErr w:type="spellEnd"/>
+      </w:hyperlink>
+    </w:p>
+    <w:p>
+      <w:r>
+        <w:t>BBZW – erster Schultag</w:t>
+      </w:r>
+    </w:p>
+    <w:p>
+      <w:r>
+        <w:t xml:space="preserve">Generiert von </w:t>
+      </w:r>
+      <w:hyperlink r:id="rId15" w:history="1">
+        <w:r>
+          <w:rPr>
+            <w:rStyle w:val="Hyperlink"/>
+          </w:rPr>
+          <w:t>Chat GPT</w:t>
+        </w:r>
+      </w:hyperlink>
+    </w:p>
+    <w:p>
+      <w:hyperlink r:id="rId16" w:history="1">
+        <w:proofErr w:type="spellStart"/>
+        <w:r>
+          <w:rPr>
+            <w:rStyle w:val="Hyperlink"/>
+          </w:rPr>
+          <w:t>Clickomania</w:t>
+        </w:r>
+        <w:proofErr w:type="spellEnd"/>
+      </w:hyperlink>
+    </w:p>
+    <w:p>
+      <w:hyperlink r:id="rId17" w:history="1">
+        <w:proofErr w:type="spellStart"/>
+        <w:r>
+          <w:rPr>
+            <w:rStyle w:val="Hyperlink"/>
+          </w:rPr>
+          <w:t>Intelligentf</w:t>
+        </w:r>
+        <w:r>
+          <w:rPr>
+            <w:rStyle w:val="Hyperlink"/>
+          </w:rPr>
+          <w:t>o</w:t>
+        </w:r>
+        <w:r>
+          <w:rPr>
+            <w:rStyle w:val="Hyperlink"/>
+          </w:rPr>
+          <w:t>od</w:t>
+        </w:r>
+        <w:proofErr w:type="spellEnd"/>
+      </w:hyperlink>
+      <w:r>
+        <w:t xml:space="preserve"> (Webseite</w:t>
+      </w:r>
+      <w:r>
+        <w:t>nabschnitt</w:t>
+      </w:r>
+      <w:r>
+        <w:t xml:space="preserve"> </w:t>
+      </w:r>
+      <w:r>
+        <w:t xml:space="preserve">leider </w:t>
+      </w:r>
+      <w:r>
+        <w:t>nicht mehr e</w:t>
+      </w:r>
+      <w:r>
+        <w:t>rreichbar)</w:t>
+      </w:r>
+    </w:p>
+    <w:p/>
+    <w:p>
+      <w:pPr>
+        <w:rPr>
+          <w:lang w:val="en-US"/>
+        </w:rPr>
+      </w:pPr>
+      <w:r>
+        <w:rPr>
+          <w:lang w:val="en-US"/>
+        </w:rPr>
+        <w:t>Favicon</w:t>
+      </w:r>
+    </w:p>
+    <w:p>
+      <w:pPr>
+        <w:rPr>
+          <w:lang w:val="en-US"/>
+        </w:rPr>
+      </w:pPr>
+      <w:hyperlink r:id="rId18" w:history="1">
+        <w:r>
+          <w:rPr>
+            <w:rStyle w:val="Hyperlink"/>
+            <w:lang w:val="en-US"/>
+          </w:rPr>
+          <w:t>Chat GPT</w:t>
+        </w:r>
+      </w:hyperlink>
+    </w:p>
+    <w:p>
+      <w:pPr>
+        <w:rPr>
+          <w:lang w:val="en-US"/>
+        </w:rPr>
+      </w:pPr>
+    </w:p>
+    <w:p>
+      <w:r>
+        <w:t>Unterstützung bei der Fehlersuche und Fehlerbehebung im Code</w:t>
+      </w:r>
+      <w:r>
+        <w:t>:</w:t>
+      </w:r>
+    </w:p>
+    <w:p>
+      <w:hyperlink r:id="rId19" w:history="1">
+        <w:r>
+          <w:rPr>
+            <w:rStyle w:val="Hyperlink"/>
+          </w:rPr>
+          <w:t>Gemini Ai</w:t>
+        </w:r>
+      </w:hyperlink>
+    </w:p>
+    <w:p>
+      <w:hyperlink r:id="rId20" w:history="1">
+        <w:r>
+          <w:rPr>
+            <w:rStyle w:val="Hyperlink"/>
+          </w:rPr>
+          <w:t>Chat GPT</w:t>
+        </w:r>
+      </w:hyperlink>
+    </w:p>
+    <w:p/>
+    <w:p>
+      <w:r>
+        <w:t>Video:</w:t>
+      </w:r>
+    </w:p>
+    <w:p>
+      <w:hyperlink r:id="rId21" w:history="1">
+        <w:r>
+          <w:rPr>
+            <w:rStyle w:val="Hyperlink"/>
+          </w:rPr>
+          <w:t>Facebook</w:t>
+        </w:r>
+      </w:hyperlink>
+    </w:p>
+    <w:p/>
+    <w:p>
+      <w:r>
+        <w:t>Audio</w:t>
+      </w:r>
+      <w:r>
+        <w:t>:</w:t>
+      </w:r>
+    </w:p>
+    <w:p>
+      <w:r>
+        <w:t xml:space="preserve">Selbst geschrieben und von </w:t>
+      </w:r>
+      <w:hyperlink r:id="rId22" w:history="1">
+        <w:r>
+          <w:rPr>
+            <w:rStyle w:val="Hyperlink"/>
+          </w:rPr>
+          <w:t>TTS Online</w:t>
+        </w:r>
+      </w:hyperlink>
+      <w:r>
+        <w:t xml:space="preserve"> in Audiodatei umwandeln lassen</w:t>
+      </w:r>
+    </w:p>
+    <w:p/>
+    <w:p>
+      <w:r>
+        <w:t>Validierung:</w:t>
+      </w:r>
+    </w:p>
+    <w:p>
+      <w:hyperlink r:id="rId23" w:history="1">
+        <w:r>
+          <w:rPr>
+            <w:rStyle w:val="Hyperlink"/>
+          </w:rPr>
+          <w:t xml:space="preserve">World Wide Web </w:t>
+        </w:r>
+        <w:proofErr w:type="spellStart"/>
+        <w:r>
+          <w:rPr>
+            <w:rStyle w:val="Hyperlink"/>
+          </w:rPr>
+          <w:t>Consortium</w:t>
+        </w:r>
+        <w:proofErr w:type="spellEnd"/>
+      </w:hyperlink>
+    </w:p>
     <w:sectPr>
-      <w:footerReference w:type="default" r:id="rId11"/>
+      <w:footerReference w:type="default" r:id="rId24"/>
       <w:pgSz w:w="11906" w:h="16838"/>
       <w:pgMar w:top="1417" w:right="1417" w:bottom="1134" w:left="1417" w:header="708" w:footer="708" w:gutter="0"/>
       <w:pgNumType w:start="0"/>
@@ -4087,7 +4695,7 @@
   <w:style w:type="paragraph" w:default="1" w:styleId="Standard">
     <w:name w:val="Normal"/>
     <w:qFormat/>
-    <w:rsid w:val="007A6646"/>
+    <w:rsid w:val="00480D18"/>
   </w:style>
   <w:style w:type="paragraph" w:styleId="berschrift1">
     <w:name w:val="heading 1"/>
@@ -4832,6 +5440,34 @@
       </w:rPr>
     </w:tblStylePr>
   </w:style>
+  <w:style w:type="paragraph" w:styleId="StandardWeb">
+    <w:name w:val="Normal (Web)"/>
+    <w:basedOn w:val="Standard"/>
+    <w:uiPriority w:val="99"/>
+    <w:unhideWhenUsed/>
+    <w:rsid w:val="00843FA9"/>
+    <w:pPr>
+      <w:spacing w:before="100" w:beforeAutospacing="1" w:after="100" w:afterAutospacing="1" w:line="240" w:lineRule="auto"/>
+    </w:pPr>
+    <w:rPr>
+      <w:rFonts w:ascii="Times New Roman" w:eastAsia="Times New Roman" w:hAnsi="Times New Roman" w:cs="Times New Roman"/>
+      <w:kern w:val="0"/>
+      <w:lang w:eastAsia="de-CH"/>
+      <w14:ligatures w14:val="none"/>
+    </w:rPr>
+  </w:style>
+  <w:style w:type="character" w:styleId="BesuchterLink">
+    <w:name w:val="FollowedHyperlink"/>
+    <w:basedOn w:val="Absatz-Standardschriftart"/>
+    <w:uiPriority w:val="99"/>
+    <w:semiHidden/>
+    <w:unhideWhenUsed/>
+    <w:rsid w:val="00AD4018"/>
+    <w:rPr>
+      <w:color w:val="96607D" w:themeColor="followedHyperlink"/>
+      <w:u w:val="single"/>
+    </w:rPr>
+  </w:style>
 </w:styles>
 </file>
 

</xml_diff>

<commit_message>
pdf verlinkt, zeilen und ordnerstruktur auf doku angepasst
</commit_message>
<xml_diff>
--- a/docu/documentation_mma25b_bachmann_ottiger.docx
+++ b/docu/documentation_mma25b_bachmann_ottiger.docx
@@ -1718,7 +1718,7 @@
               <w:rPr>
                 <w:lang w:val="de-DE" w:eastAsia="de-DE"/>
               </w:rPr>
-              <w:t>7</w:t>
+              <w:t>8</w:t>
             </w:r>
             <w:r>
               <w:rPr>
@@ -1730,31 +1730,31 @@
               <w:rPr>
                 <w:lang w:val="de-DE" w:eastAsia="de-DE"/>
               </w:rPr>
-              <w:t>7</w:t>
-            </w:r>
-            <w:r>
-              <w:rPr>
-                <w:lang w:val="de-DE" w:eastAsia="de-DE"/>
-              </w:rPr>
-              <w:t>, 12</w:t>
-            </w:r>
-            <w:r>
-              <w:rPr>
-                <w:lang w:val="de-DE" w:eastAsia="de-DE"/>
-              </w:rPr>
-              <w:t>7</w:t>
-            </w:r>
-            <w:r>
-              <w:rPr>
-                <w:lang w:val="de-DE" w:eastAsia="de-DE"/>
-              </w:rPr>
-              <w:t>, 13</w:t>
-            </w:r>
-            <w:r>
-              <w:rPr>
-                <w:lang w:val="de-DE" w:eastAsia="de-DE"/>
-              </w:rPr>
-              <w:t>7</w:t>
+              <w:t>9</w:t>
+            </w:r>
+            <w:r>
+              <w:rPr>
+                <w:lang w:val="de-DE" w:eastAsia="de-DE"/>
+              </w:rPr>
+              <w:t>, 1</w:t>
+            </w:r>
+            <w:r>
+              <w:rPr>
+                <w:lang w:val="de-DE" w:eastAsia="de-DE"/>
+              </w:rPr>
+              <w:t>30</w:t>
+            </w:r>
+            <w:r>
+              <w:rPr>
+                <w:lang w:val="de-DE" w:eastAsia="de-DE"/>
+              </w:rPr>
+              <w:t>, 1</w:t>
+            </w:r>
+            <w:r>
+              <w:rPr>
+                <w:lang w:val="de-DE" w:eastAsia="de-DE"/>
+              </w:rPr>
+              <w:t>41</w:t>
             </w:r>
           </w:p>
         </w:tc>
@@ -2204,7 +2204,7 @@
               <w:rPr>
                 <w:lang w:val="en-US" w:eastAsia="de-DE"/>
               </w:rPr>
-              <w:t>56</w:t>
+              <w:t>62</w:t>
             </w:r>
           </w:p>
         </w:tc>
@@ -2267,49 +2267,49 @@
               <w:rPr>
                 <w:lang w:eastAsia="de-DE"/>
               </w:rPr>
+              <w:t>1</w:t>
+            </w:r>
+            <w:r>
+              <w:rPr>
+                <w:lang w:eastAsia="de-DE"/>
+              </w:rPr>
               <w:t>10</w:t>
             </w:r>
             <w:r>
               <w:rPr>
                 <w:lang w:eastAsia="de-DE"/>
               </w:rPr>
-              <w:t>9</w:t>
+              <w:t>, 1</w:t>
             </w:r>
             <w:r>
               <w:rPr>
                 <w:lang w:eastAsia="de-DE"/>
               </w:rPr>
-              <w:t>, 11</w:t>
+              <w:t>21</w:t>
             </w:r>
             <w:r>
               <w:rPr>
                 <w:lang w:eastAsia="de-DE"/>
               </w:rPr>
-              <w:t>9</w:t>
+              <w:t>, 1</w:t>
             </w:r>
             <w:r>
               <w:rPr>
                 <w:lang w:eastAsia="de-DE"/>
               </w:rPr>
-              <w:t>, 12</w:t>
+              <w:t>32</w:t>
             </w:r>
             <w:r>
               <w:rPr>
                 <w:lang w:eastAsia="de-DE"/>
               </w:rPr>
-              <w:t>9</w:t>
+              <w:t xml:space="preserve"> &amp; 1</w:t>
             </w:r>
             <w:r>
               <w:rPr>
                 <w:lang w:eastAsia="de-DE"/>
               </w:rPr>
-              <w:t xml:space="preserve"> &amp; 13</w:t>
-            </w:r>
-            <w:r>
-              <w:rPr>
-                <w:lang w:eastAsia="de-DE"/>
-              </w:rPr>
-              <w:t>9</w:t>
+              <w:t>43</w:t>
             </w:r>
           </w:p>
         </w:tc>
@@ -3029,9 +3029,9 @@
                 <w:noProof/>
               </w:rPr>
               <w:drawing>
-                <wp:inline distT="0" distB="0" distL="0" distR="0" wp14:anchorId="0977D3E3" wp14:editId="550857AC">
-                  <wp:extent cx="2484120" cy="4707890"/>
-                  <wp:effectExtent l="0" t="0" r="0" b="0"/>
+                <wp:inline distT="0" distB="0" distL="0" distR="0" wp14:anchorId="0977D3E3" wp14:editId="32902F06">
+                  <wp:extent cx="2340179" cy="4707890"/>
+                  <wp:effectExtent l="0" t="0" r="3175" b="0"/>
                   <wp:docPr id="34678049" name="Grafik 1"/>
                   <wp:cNvGraphicFramePr>
                     <a:graphicFrameLocks xmlns:a="http://schemas.openxmlformats.org/drawingml/2006/main" noChangeAspect="1"/>
@@ -3040,7 +3040,7 @@
                     <a:graphicData uri="http://schemas.openxmlformats.org/drawingml/2006/picture">
                       <pic:pic xmlns:pic="http://schemas.openxmlformats.org/drawingml/2006/picture">
                         <pic:nvPicPr>
-                          <pic:cNvPr id="34678049" name=""/>
+                          <pic:cNvPr id="34678049" name="Grafik 1"/>
                           <pic:cNvPicPr/>
                         </pic:nvPicPr>
                         <pic:blipFill>
@@ -3058,7 +3058,7 @@
                         <pic:spPr>
                           <a:xfrm>
                             <a:off x="0" y="0"/>
-                            <a:ext cx="2484120" cy="4707890"/>
+                            <a:ext cx="2340179" cy="4707890"/>
                           </a:xfrm>
                           <a:prstGeom prst="rect">
                             <a:avLst/>
@@ -3553,77 +3553,45 @@
           <w:rPr>
             <w:rStyle w:val="Hyperlink"/>
           </w:rPr>
-          <w:t>Intelligentf</w:t>
+          <w:t>Intelligentfood</w:t>
         </w:r>
+      </w:hyperlink>
+      <w:r>
+        <w:t xml:space="preserve"> (Webseite</w:t>
+      </w:r>
+      <w:r>
+        <w:t>nabschnitt</w:t>
+      </w:r>
+      <w:r>
+        <w:t xml:space="preserve"> </w:t>
+      </w:r>
+      <w:r>
+        <w:t xml:space="preserve">leider </w:t>
+      </w:r>
+      <w:r>
+        <w:t>nicht mehr e</w:t>
+      </w:r>
+      <w:r>
+        <w:t>rreichbar)</w:t>
+      </w:r>
+    </w:p>
+    <w:p/>
+    <w:p>
+      <w:r>
+        <w:t>Favicon</w:t>
+      </w:r>
+    </w:p>
+    <w:p>
+      <w:hyperlink r:id="rId18" w:history="1">
         <w:r>
           <w:rPr>
             <w:rStyle w:val="Hyperlink"/>
           </w:rPr>
-          <w:t>o</w:t>
-        </w:r>
-        <w:r>
-          <w:rPr>
-            <w:rStyle w:val="Hyperlink"/>
-          </w:rPr>
-          <w:t>od</w:t>
-        </w:r>
-      </w:hyperlink>
-      <w:r>
-        <w:t xml:space="preserve"> (Webseite</w:t>
-      </w:r>
-      <w:r>
-        <w:t>nabschnitt</w:t>
-      </w:r>
-      <w:r>
-        <w:t xml:space="preserve"> </w:t>
-      </w:r>
-      <w:r>
-        <w:t xml:space="preserve">leider </w:t>
-      </w:r>
-      <w:r>
-        <w:t>nicht mehr e</w:t>
-      </w:r>
-      <w:r>
-        <w:t>rreichbar)</w:t>
-      </w:r>
-    </w:p>
-    <w:p/>
-    <w:p>
-      <w:pPr>
-        <w:rPr>
-          <w:lang w:val="en-US"/>
-        </w:rPr>
-      </w:pPr>
-      <w:r>
-        <w:rPr>
-          <w:lang w:val="en-US"/>
-        </w:rPr>
-        <w:t>Favicon</w:t>
-      </w:r>
-    </w:p>
-    <w:p>
-      <w:pPr>
-        <w:rPr>
-          <w:lang w:val="en-US"/>
-        </w:rPr>
-      </w:pPr>
-      <w:hyperlink r:id="rId18" w:history="1">
-        <w:r>
-          <w:rPr>
-            <w:rStyle w:val="Hyperlink"/>
-            <w:lang w:val="en-US"/>
-          </w:rPr>
           <w:t>Chat GPT</w:t>
         </w:r>
       </w:hyperlink>
     </w:p>
-    <w:p>
-      <w:pPr>
-        <w:rPr>
-          <w:lang w:val="en-US"/>
-        </w:rPr>
-      </w:pPr>
-    </w:p>
+    <w:p/>
     <w:p>
       <w:r>
         <w:t>Unterstützung bei der Fehlersuche und Fehlerbehebung im Code</w:t>
@@ -3671,10 +3639,7 @@
     <w:p/>
     <w:p>
       <w:r>
-        <w:t>Audio</w:t>
-      </w:r>
-      <w:r>
-        <w:t>:</w:t>
+        <w:t>Audio:</w:t>
       </w:r>
     </w:p>
     <w:p>
@@ -4996,6 +4961,7 @@
   <w:style w:type="character" w:default="1" w:styleId="Absatz-Standardschriftart">
     <w:name w:val="Default Paragraph Font"/>
     <w:uiPriority w:val="1"/>
+    <w:semiHidden/>
     <w:unhideWhenUsed/>
   </w:style>
   <w:style w:type="table" w:default="1" w:styleId="NormaleTabelle">

</xml_diff>

<commit_message>
lowkey alles nomol es bizeli gändered oderso
</commit_message>
<xml_diff>
--- a/docu/documentation_mma25b_bachmann_ottiger.docx
+++ b/docu/documentation_mma25b_bachmann_ottiger.docx
@@ -2346,14 +2346,38 @@
             <w:pPr>
               <w:cnfStyle w:val="000000000000" w:firstRow="0" w:lastRow="0" w:firstColumn="0" w:lastColumn="0" w:oddVBand="0" w:evenVBand="0" w:oddHBand="0" w:evenHBand="0" w:firstRowFirstColumn="0" w:firstRowLastColumn="0" w:lastRowFirstColumn="0" w:lastRowLastColumn="0"/>
               <w:rPr>
-                <w:lang w:eastAsia="de-DE"/>
-              </w:rPr>
-            </w:pPr>
-            <w:r>
-              <w:rPr>
-                <w:lang w:eastAsia="de-DE"/>
+                <w:lang w:val="en-US" w:eastAsia="de-DE"/>
+              </w:rPr>
+            </w:pPr>
+            <w:r>
+              <w:rPr>
+                <w:lang w:val="en-US" w:eastAsia="de-DE"/>
               </w:rPr>
               <w:t>contact.html</w:t>
+            </w:r>
+            <w:r>
+              <w:rPr>
+                <w:lang w:val="en-US" w:eastAsia="de-DE"/>
+              </w:rPr>
+              <w:t xml:space="preserve"> </w:t>
+            </w:r>
+            <w:r>
+              <w:rPr>
+                <w:lang w:val="en-US" w:eastAsia="de-DE"/>
+              </w:rPr>
+              <w:t xml:space="preserve">&amp; </w:t>
+            </w:r>
+            <w:r>
+              <w:rPr>
+                <w:lang w:val="en-US" w:eastAsia="de-DE"/>
+              </w:rPr>
+              <w:t>flavors.ht</w:t>
+            </w:r>
+            <w:r>
+              <w:rPr>
+                <w:lang w:val="en-US" w:eastAsia="de-DE"/>
+              </w:rPr>
+              <w:t>ml</w:t>
             </w:r>
           </w:p>
         </w:tc>
@@ -2379,6 +2403,12 @@
                 <w:lang w:eastAsia="de-DE"/>
               </w:rPr>
               <w:t>9</w:t>
+            </w:r>
+            <w:r>
+              <w:rPr>
+                <w:lang w:eastAsia="de-DE"/>
+              </w:rPr>
+              <w:t xml:space="preserve"> und 98</w:t>
             </w:r>
           </w:p>
         </w:tc>
@@ -3204,7 +3234,15 @@
     </w:p>
     <w:p>
       <w:r>
-        <w:t xml:space="preserve">Als zusätzliches CSS-Feature wählten wir den Parallax Effekt, welchen wir auf dem </w:t>
+        <w:t xml:space="preserve">Als zusätzliches CSS-Feature wählten wir den </w:t>
+      </w:r>
+      <w:proofErr w:type="spellStart"/>
+      <w:r>
+        <w:t>Parallax</w:t>
+      </w:r>
+      <w:proofErr w:type="spellEnd"/>
+      <w:r>
+        <w:t xml:space="preserve"> Effekt, welchen wir auf dem </w:t>
       </w:r>
     </w:p>
     <w:p>
@@ -3317,7 +3355,15 @@
     </w:p>
     <w:p>
       <w:r>
-        <w:t>Wenn wir mehr Zeit für das Projekt gehabt hätten, würden wir gerne noch weitere Flavor-Sorten entwerfen und deren Details noch ausführlicher beschreiben. Zusätzlich fänden wir es ein cooles Feature, wenn unser Standort direkt mit Google Maps verknüpft wäre, damit man das Büro direkt auf einer interaktiven Karte finden kann.</w:t>
+        <w:t xml:space="preserve">Wenn wir mehr Zeit für das Projekt gehabt hätten, würden wir gerne noch weitere Flavor-Sorten entwerfen und deren Details noch ausführlicher beschreiben. </w:t>
+      </w:r>
+    </w:p>
+    <w:p>
+      <w:pPr>
+        <w:spacing w:before="120"/>
+      </w:pPr>
+      <w:r>
+        <w:t>Zusätzlich fänden wir es ein cooles Feature, wenn unser Standort direkt mit Google Maps verknüpft wäre, damit man das Büro direkt auf einer interaktiven Karte finden kann.</w:t>
       </w:r>
     </w:p>
     <w:p/>
@@ -3418,7 +3464,6 @@
       </w:pPr>
       <w:bookmarkStart w:id="12" w:name="_Toc231157442"/>
       <w:r>
-        <w:lastRenderedPageBreak/>
         <w:t>Selbstständigkeitserklärung</w:t>
       </w:r>
       <w:bookmarkEnd w:id="12"/>
@@ -3682,6 +3727,9 @@
       </w:hyperlink>
       <w:r>
         <w:t xml:space="preserve"> in Audiodatei umwandeln lassen</w:t>
+      </w:r>
+      <w:r>
+        <w:t>.</w:t>
       </w:r>
     </w:p>
     <w:p/>

</xml_diff>